<commit_message>
Group local development and testing under ags_local_use
</commit_message>
<xml_diff>
--- a/ags_docs/Aegis_Architecture_and_Deployment_Handover.docx
+++ b/ags_docs/Aegis_Architecture_and_Deployment_Handover.docx
@@ -6247,7 +6247,7 @@
                 <w:color w:val="000000"/>
                 <w:sz w:val="20"/>
               </w:rPr>
-              <w:t>Image release, pilot tooling, backup and explicit QA utilities</w:t>
+              <w:t>OCI release, authentication, runtime tooling and storage migration</w:t>
             </w:r>
           </w:p>
         </w:tc>
@@ -6284,7 +6284,7 @@
                 <w:color w:val="000000"/>
                 <w:sz w:val="20"/>
               </w:rPr>
-              <w:t>local</w:t>
+              <w:t>ags_local_use</w:t>
             </w:r>
           </w:p>
         </w:tc>
@@ -6316,7 +6316,7 @@
                 <w:color w:val="000000"/>
                 <w:sz w:val="20"/>
               </w:rPr>
-              <w:t>Separate laptop Compose profiles, environment templates and launchers</w:t>
+              <w:t>Local profiles, launchers, test containers, optional Kubernetes and manual QA tools</w:t>
             </w:r>
           </w:p>
         </w:tc>
@@ -6332,7 +6332,7 @@
         <w:widowControl/>
       </w:pPr>
       <w:r>
-        <w:t>For a separate local installation, use local/ags_scripts/setup.sh and local/compose.yaml, or the Windows Oracle launcher local/ags_scripts/start-oracle.ps1. Use independent data and secrets. Those development alternatives do not describe the live OCI topology. Root README is the brief GitHub entry point; this Word file is the single maintained handover.</w:t>
+        <w:t>For a separate local installation, use ags_local_use/ags_scripts/setup.sh and ags_local_use/compose.yaml, or the Windows Oracle launcher ags_local_use/ags_scripts/start-oracle.ps1. Use independent data and secrets. Those development alternatives do not describe the live OCI topology. Root README is the brief GitHub entry point; this Word file is the single maintained handover.</w:t>
       </w:r>
     </w:p>
     <w:p>

</xml_diff>

<commit_message>
Remove optional storage migration tooling
</commit_message>
<xml_diff>
--- a/ags_docs/Aegis_Architecture_and_Deployment_Handover.docx
+++ b/ags_docs/Aegis_Architecture_and_Deployment_Handover.docx
@@ -6215,7 +6215,7 @@
                 <w:color w:val="000000"/>
                 <w:sz w:val="20"/>
               </w:rPr>
-              <w:t>ags_deploy and ags_scripts</w:t>
+              <w:t>ags_deploy</w:t>
             </w:r>
           </w:p>
         </w:tc>
@@ -6247,7 +6247,7 @@
                 <w:color w:val="000000"/>
                 <w:sz w:val="20"/>
               </w:rPr>
-              <w:t>OCI release, authentication, runtime tooling and storage migration</w:t>
+              <w:t>OCI release, authentication and runtime tooling</w:t>
             </w:r>
           </w:p>
         </w:tc>

</xml_diff>

<commit_message>
Centralize tests and QA under ags_testing
</commit_message>
<xml_diff>
--- a/ags_docs/Aegis_Architecture_and_Deployment_Handover.docx
+++ b/ags_docs/Aegis_Architecture_and_Deployment_Handover.docx
@@ -6316,7 +6316,76 @@
                 <w:color w:val="000000"/>
                 <w:sz w:val="20"/>
               </w:rPr>
-              <w:t>Local profiles, launchers, test containers, optional Kubernetes and manual QA tools</w:t>
+              <w:t>Local runtime profiles, launchers, Oracle Free setup and optional Kubernetes</w:t>
+            </w:r>
+          </w:p>
+        </w:tc>
+      </w:tr>
+      <w:tr>
+        <w:trPr>
+          <w:cantSplit/>
+        </w:trPr>
+        <w:tc>
+          <w:tcPr>
+            <w:tcW w:type="dxa" w:w="2952"/>
+            <w:vAlign w:val="center"/>
+            <w:shd w:fill="F0F4F8"/>
+            <w:tcMar>
+              <w:top w:w="85" w:type="dxa"/>
+              <w:bottom w:w="85" w:type="dxa"/>
+              <w:left w:w="110" w:type="dxa"/>
+              <w:right w:w="110" w:type="dxa"/>
+            </w:tcMar>
+            <w:tcBorders>
+              <w:top w:val="single" w:sz="4" w:color="D9D9D9"/>
+              <w:bottom w:val="single" w:sz="4" w:color="D9D9D9"/>
+              <w:left w:val="single" w:sz="4" w:color="D9D9D9"/>
+              <w:right w:val="single" w:sz="4" w:color="D9D9D9"/>
+            </w:tcBorders>
+          </w:tcPr>
+          <w:p>
+            <w:pPr>
+              <w:spacing w:after="0" w:line="245" w:lineRule="auto"/>
+            </w:pPr>
+            <w:r>
+              <w:rPr>
+                <w:b w:val="0"/>
+                <w:color w:val="000000"/>
+                <w:sz w:val="20"/>
+              </w:rPr>
+              <w:t>ags_testing</w:t>
+            </w:r>
+          </w:p>
+        </w:tc>
+        <w:tc>
+          <w:tcPr>
+            <w:tcW w:type="dxa" w:w="7272"/>
+            <w:vAlign w:val="center"/>
+            <w:shd w:fill="F0F4F8"/>
+            <w:tcMar>
+              <w:top w:w="85" w:type="dxa"/>
+              <w:bottom w:w="85" w:type="dxa"/>
+              <w:left w:w="110" w:type="dxa"/>
+              <w:right w:w="110" w:type="dxa"/>
+            </w:tcMar>
+            <w:tcBorders>
+              <w:top w:val="single" w:sz="4" w:color="D9D9D9"/>
+              <w:bottom w:val="single" w:sz="4" w:color="D9D9D9"/>
+              <w:left w:val="single" w:sz="4" w:color="D9D9D9"/>
+              <w:right w:val="single" w:sz="4" w:color="D9D9D9"/>
+            </w:tcBorders>
+          </w:tcPr>
+          <w:p>
+            <w:pPr>
+              <w:spacing w:after="0" w:line="245" w:lineRule="auto"/>
+            </w:pPr>
+            <w:r>
+              <w:rPr>
+                <w:b w:val="0"/>
+                <w:color w:val="000000"/>
+                <w:sz w:val="20"/>
+              </w:rPr>
+              <w:t>Backend/frontend tests, fixtures, QA scripts and test containers</w:t>
             </w:r>
           </w:p>
         </w:tc>
@@ -6353,7 +6422,7 @@
         <w:widowControl/>
       </w:pPr>
       <w:r>
-        <w:t>The final handover branch is ags_sprint1, created from the python source freeze. Tag aegis-freeze-2026-10-15 remains unchanged. The tag identifies source, not proof that the deployed images are byte-for-byte builds of that commit. The source-only manifest at the tag fingerprints 481 inputs; subsequent documentation edits do not redeploy the application.</w:t>
+        <w:t>The final handover branch is ags_sprint1, created from the python source freeze. Tag aegis-freeze-2026-10-15 remains unchanged. The tag identifies source, not proof that the deployed images are byte-for-byte builds of that commit. The source-only manifest at the tag fingerprints 481 inputs; later documentation and folder changes on ags_sprint1 do not redeploy the application.</w:t>
       </w:r>
     </w:p>
     <w:tbl>
@@ -6501,7 +6570,7 @@
                 <w:color w:val="000000"/>
                 <w:sz w:val="20"/>
               </w:rPr>
-              <w:t>1062 passed, 5 skipped, 1 API documentation catalog mismatch in 921.74 seconds</w:t>
+              <w:t>16 October 2026: 1047 passed, 5 skipped in 1038.96s; temporary SQLite and mock providers</w:t>
             </w:r>
           </w:p>
         </w:tc>
@@ -6538,7 +6607,7 @@
                 <w:color w:val="000000"/>
                 <w:sz w:val="20"/>
               </w:rPr>
-              <w:t>After catalog correction</w:t>
+              <w:t>Test folder reorganization</w:t>
             </w:r>
           </w:p>
         </w:tc>
@@ -6570,7 +6639,7 @@
                 <w:color w:val="000000"/>
                 <w:sz w:val="20"/>
               </w:rPr>
-              <w:t>Both API documentation tests passed; the full 15-minute suite was not repeated after that descriptions-only fix</w:t>
+              <w:t>Tests, fixtures and QA tools are under ags_testing; imports, CI, Compose and container paths verified</w:t>
             </w:r>
           </w:p>
         </w:tc>
@@ -6639,7 +6708,7 @@
                 <w:color w:val="000000"/>
                 <w:sz w:val="20"/>
               </w:rPr>
-              <w:t>178 passed; type checking and production build passed</w:t>
+              <w:t>178 passed; types and Linux standalone build passed. All 27 browser tests listed only</w:t>
             </w:r>
           </w:p>
         </w:tc>
@@ -6939,7 +7008,7 @@
         <w:widowControl/>
       </w:pPr>
       <w:r>
-        <w:t>GitHub Actions triggers on main pushes and pull requests. A direct documentation push to ags_sprint1 is not a fresh CI run and does not deploy the application. Tests were not rerun merely for document consolidation because application execution code and infrastructure definitions were unchanged.</w:t>
+        <w:t>GitHub Actions triggers on main pushes and pull requests. A direct push to ags_sprint1 is not a fresh CI run and does not deploy the application. The 16 October test relocation was validated locally with temporary SQLite and mock providers; no cloud workload, database or storage settings were changed.</w:t>
       </w:r>
     </w:p>
     <w:p>

</xml_diff>